<commit_message>
chore: configure AWS S3 for webscraping - update bucket name to urbanai-data-lake and region to sa-east-1
</commit_message>
<xml_diff>
--- a/docs/relatorio-status-dia7.docx
+++ b/docs/relatorio-status-dia7.docx
@@ -96,7 +96,7 @@
                 <w:sz w:val="44"/>
                 <w:szCs w:val="44"/>
               </w:rPr>
-              <w:t xml:space="preserve">DIA 8 DE 14</w:t>
+              <w:t xml:space="preserve">DIA 11 DE 14</w:t>
             </w:r>
           </w:p>
           <w:p>
@@ -142,7 +142,7 @@
                 <w:sz w:val="17"/>
                 <w:szCs w:val="17"/>
               </w:rPr>
-              <w:t xml:space="preserve">Responsável: Gustavo Macedo   |   12/03/2026   |   D1: 03/03/2026</w:t>
+              <w:t xml:space="preserve">Responsável: Gustavo Macedo   |   17/03/2026   |   D1: 03/03/2026</w:t>
             </w:r>
           </w:p>
         </w:tc>
@@ -286,7 +286,7 @@
                 <w:sz w:val="52"/>
                 <w:szCs w:val="52"/>
               </w:rPr>
-              <w:t xml:space="preserve">26</w:t>
+              <w:t xml:space="preserve">34</w:t>
             </w:r>
           </w:p>
           <w:p>
@@ -700,7 +700,7 @@
           <w:sz w:val="18"/>
           <w:szCs w:val="18"/>
         </w:rPr>
-        <w:t xml:space="preserve">   80%</w:t>
+        <w:t xml:space="preserve">   95%</w:t>
       </w:r>
     </w:p>
     <w:tbl>
@@ -716,13 +716,13 @@
         </w:tblBorders>
       </w:tblPr>
       <w:tblGrid>
-        <w:gridCol w:w="7221"/>
-        <w:gridCol w:w="1805"/>
+        <w:gridCol w:w="8575"/>
+        <w:gridCol w:w="451"/>
       </w:tblGrid>
       <w:tr>
         <w:tc>
           <w:tcPr>
-            <w:tcW w:type="dxa" w:w="7221"/>
+            <w:tcW w:type="dxa" w:w="8575"/>
             <w:tcBorders>
               <w:top w:val="none" w:color="FFFFFF" w:sz="0"/>
               <w:left w:val="none" w:color="FFFFFF" w:sz="0"/>
@@ -745,7 +745,7 @@
         </w:tc>
         <w:tc>
           <w:tcPr>
-            <w:tcW w:type="dxa" w:w="1805"/>
+            <w:tcW w:type="dxa" w:w="451"/>
             <w:tcBorders>
               <w:top w:val="none" w:color="FFFFFF" w:sz="0"/>
               <w:left w:val="none" w:color="FFFFFF" w:sz="0"/>
@@ -805,7 +805,7 @@
           <w:sz w:val="18"/>
           <w:szCs w:val="18"/>
         </w:rPr>
-        <w:t xml:space="preserve">   35%</w:t>
+        <w:t xml:space="preserve">   80%</w:t>
       </w:r>
     </w:p>
     <w:tbl>
@@ -821,13 +821,13 @@
         </w:tblBorders>
       </w:tblPr>
       <w:tblGrid>
-        <w:gridCol w:w="3159"/>
-        <w:gridCol w:w="5867"/>
+        <w:gridCol w:w="7221"/>
+        <w:gridCol w:w="1805"/>
       </w:tblGrid>
       <w:tr>
         <w:tc>
           <w:tcPr>
-            <w:tcW w:type="dxa" w:w="3159"/>
+            <w:tcW w:type="dxa" w:w="7221"/>
             <w:tcBorders>
               <w:top w:val="none" w:color="FFFFFF" w:sz="0"/>
               <w:left w:val="none" w:color="FFFFFF" w:sz="0"/>
@@ -850,7 +850,7 @@
         </w:tc>
         <w:tc>
           <w:tcPr>
-            <w:tcW w:type="dxa" w:w="5867"/>
+            <w:tcW w:type="dxa" w:w="1805"/>
             <w:tcBorders>
               <w:top w:val="none" w:color="FFFFFF" w:sz="0"/>
               <w:left w:val="none" w:color="FFFFFF" w:sz="0"/>
@@ -910,7 +910,7 @@
           <w:sz w:val="18"/>
           <w:szCs w:val="18"/>
         </w:rPr>
-        <w:t xml:space="preserve">   45%</w:t>
+        <w:t xml:space="preserve">   75%</w:t>
       </w:r>
     </w:p>
     <w:tbl>
@@ -926,13 +926,13 @@
         </w:tblBorders>
       </w:tblPr>
       <w:tblGrid>
-        <w:gridCol w:w="4062"/>
-        <w:gridCol w:w="4964"/>
+        <w:gridCol w:w="6770"/>
+        <w:gridCol w:w="2256"/>
       </w:tblGrid>
       <w:tr>
         <w:tc>
           <w:tcPr>
-            <w:tcW w:type="dxa" w:w="4062"/>
+            <w:tcW w:type="dxa" w:w="6770"/>
             <w:tcBorders>
               <w:top w:val="none" w:color="FFFFFF" w:sz="0"/>
               <w:left w:val="none" w:color="FFFFFF" w:sz="0"/>
@@ -955,7 +955,7 @@
         </w:tc>
         <w:tc>
           <w:tcPr>
-            <w:tcW w:type="dxa" w:w="4964"/>
+            <w:tcW w:type="dxa" w:w="2256"/>
             <w:tcBorders>
               <w:top w:val="none" w:color="FFFFFF" w:sz="0"/>
               <w:left w:val="none" w:color="FFFFFF" w:sz="0"/>
@@ -2665,6 +2665,434 @@
                 <w:szCs w:val="18"/>
               </w:rPr>
               <w:t xml:space="preserve">Maps API + OAuth 2.0 configurados | Crédito gratuito: R$ 1.759 (válido até 15/06/2026)</w:t>
+            </w:r>
+          </w:p>
+        </w:tc>
+        <w:tc>
+          <w:tcPr>
+            <w:tcW w:type="dxa" w:w="1444"/>
+            <w:tcBorders>
+              <w:top w:val="single" w:color="D1D5DB" w:sz="3"/>
+              <w:left w:val="single" w:color="D1D5DB" w:sz="3"/>
+              <w:bottom w:val="single" w:color="D1D5DB" w:sz="3"/>
+              <w:right w:val="single" w:color="D1D5DB" w:sz="3"/>
+            </w:tcBorders>
+            <w:shd w:fill="FFFFFF" w:val="clear"/>
+            <w:tcMar>
+              <w:top w:type="dxa" w:w="80"/>
+              <w:left w:type="dxa" w:w="140"/>
+              <w:bottom w:type="dxa" w:w="80"/>
+              <w:right w:type="dxa" w:w="140"/>
+            </w:tcMar>
+            <w:vAlign w:val="center"/>
+          </w:tcPr>
+          <w:p>
+            <w:pPr>
+              <w:jc w:val="left"/>
+            </w:pPr>
+            <w:r>
+              <w:rPr>
+                <w:rFonts w:ascii="Arial" w:cs="Arial" w:eastAsia="Arial" w:hAnsi="Arial"/>
+                <w:b w:val="false"/>
+                <w:bCs w:val="false"/>
+                <w:color w:val="0D1117"/>
+                <w:sz w:val="18"/>
+                <w:szCs w:val="18"/>
+              </w:rPr>
+              <w:t xml:space="preserve">D8</w:t>
+            </w:r>
+          </w:p>
+        </w:tc>
+      </w:tr>
+      <w:tr>
+        <w:tc>
+          <w:tcPr>
+            <w:tcW w:type="dxa" w:w="3610"/>
+            <w:tcBorders>
+              <w:top w:val="single" w:color="D1D5DB" w:sz="3"/>
+              <w:left w:val="single" w:color="D1D5DB" w:sz="3"/>
+              <w:bottom w:val="single" w:color="D1D5DB" w:sz="3"/>
+              <w:right w:val="single" w:color="D1D5DB" w:sz="3"/>
+            </w:tcBorders>
+            <w:shd w:fill="F5F4EF" w:val="clear"/>
+            <w:tcMar>
+              <w:top w:type="dxa" w:w="80"/>
+              <w:left w:type="dxa" w:w="140"/>
+              <w:bottom w:type="dxa" w:w="80"/>
+              <w:right w:type="dxa" w:w="140"/>
+            </w:tcMar>
+            <w:vAlign w:val="center"/>
+          </w:tcPr>
+          <w:p>
+            <w:pPr>
+              <w:jc w:val="left"/>
+            </w:pPr>
+            <w:r>
+              <w:rPr>
+                <w:rFonts w:ascii="Arial" w:cs="Arial" w:eastAsia="Arial" w:hAnsi="Arial"/>
+                <w:b w:val="false"/>
+                <w:bCs w:val="false"/>
+                <w:color w:val="0D1117"/>
+                <w:sz w:val="18"/>
+                <w:szCs w:val="18"/>
+              </w:rPr>
+              <w:t xml:space="preserve">AWS S3 — Data Lake</w:t>
+            </w:r>
+          </w:p>
+        </w:tc>
+        <w:tc>
+          <w:tcPr>
+            <w:tcW w:type="dxa" w:w="3971"/>
+            <w:tcBorders>
+              <w:top w:val="single" w:color="D1D5DB" w:sz="3"/>
+              <w:left w:val="single" w:color="D1D5DB" w:sz="3"/>
+              <w:bottom w:val="single" w:color="D1D5DB" w:sz="3"/>
+              <w:right w:val="single" w:color="D1D5DB" w:sz="3"/>
+            </w:tcBorders>
+            <w:shd w:fill="F5F4EF" w:val="clear"/>
+            <w:tcMar>
+              <w:top w:type="dxa" w:w="80"/>
+              <w:left w:type="dxa" w:w="140"/>
+              <w:bottom w:type="dxa" w:w="80"/>
+              <w:right w:type="dxa" w:w="140"/>
+            </w:tcMar>
+            <w:vAlign w:val="center"/>
+          </w:tcPr>
+          <w:p>
+            <w:pPr>
+              <w:jc w:val="left"/>
+            </w:pPr>
+            <w:r>
+              <w:rPr>
+                <w:rFonts w:ascii="Arial" w:cs="Arial" w:eastAsia="Arial" w:hAnsi="Arial"/>
+                <w:b w:val="false"/>
+                <w:bCs w:val="false"/>
+                <w:color w:val="0D1117"/>
+                <w:sz w:val="18"/>
+                <w:szCs w:val="18"/>
+              </w:rPr>
+              <w:t xml:space="preserve">Bucket urbanai-data-lake (sa-east-1) + IAM user urban-ai-scrapy | Crédito: USD 200</w:t>
+            </w:r>
+          </w:p>
+        </w:tc>
+        <w:tc>
+          <w:tcPr>
+            <w:tcW w:type="dxa" w:w="1444"/>
+            <w:tcBorders>
+              <w:top w:val="single" w:color="D1D5DB" w:sz="3"/>
+              <w:left w:val="single" w:color="D1D5DB" w:sz="3"/>
+              <w:bottom w:val="single" w:color="D1D5DB" w:sz="3"/>
+              <w:right w:val="single" w:color="D1D5DB" w:sz="3"/>
+            </w:tcBorders>
+            <w:shd w:fill="F5F4EF" w:val="clear"/>
+            <w:tcMar>
+              <w:top w:type="dxa" w:w="80"/>
+              <w:left w:type="dxa" w:w="140"/>
+              <w:bottom w:type="dxa" w:w="80"/>
+              <w:right w:type="dxa" w:w="140"/>
+            </w:tcMar>
+            <w:vAlign w:val="center"/>
+          </w:tcPr>
+          <w:p>
+            <w:pPr>
+              <w:jc w:val="left"/>
+            </w:pPr>
+            <w:r>
+              <w:rPr>
+                <w:rFonts w:ascii="Arial" w:cs="Arial" w:eastAsia="Arial" w:hAnsi="Arial"/>
+                <w:b w:val="false"/>
+                <w:bCs w:val="false"/>
+                <w:color w:val="0D1117"/>
+                <w:sz w:val="18"/>
+                <w:szCs w:val="18"/>
+              </w:rPr>
+              <w:t xml:space="preserve">D8</w:t>
+            </w:r>
+          </w:p>
+        </w:tc>
+      </w:tr>
+      <w:tr>
+        <w:tc>
+          <w:tcPr>
+            <w:tcW w:type="dxa" w:w="3610"/>
+            <w:tcBorders>
+              <w:top w:val="single" w:color="D1D5DB" w:sz="3"/>
+              <w:left w:val="single" w:color="D1D5DB" w:sz="3"/>
+              <w:bottom w:val="single" w:color="D1D5DB" w:sz="3"/>
+              <w:right w:val="single" w:color="D1D5DB" w:sz="3"/>
+            </w:tcBorders>
+            <w:shd w:fill="FFFFFF" w:val="clear"/>
+            <w:tcMar>
+              <w:top w:type="dxa" w:w="80"/>
+              <w:left w:type="dxa" w:w="140"/>
+              <w:bottom w:type="dxa" w:w="80"/>
+              <w:right w:type="dxa" w:w="140"/>
+            </w:tcMar>
+            <w:vAlign w:val="center"/>
+          </w:tcPr>
+          <w:p>
+            <w:pPr>
+              <w:jc w:val="left"/>
+            </w:pPr>
+            <w:r>
+              <w:rPr>
+                <w:rFonts w:ascii="Arial" w:cs="Arial" w:eastAsia="Arial" w:hAnsi="Arial"/>
+                <w:b w:val="false"/>
+                <w:bCs w:val="false"/>
+                <w:color w:val="0D1117"/>
+                <w:sz w:val="18"/>
+                <w:szCs w:val="18"/>
+              </w:rPr>
+              <w:t xml:space="preserve">RapidAPI — conta Urban AI</w:t>
+            </w:r>
+          </w:p>
+        </w:tc>
+        <w:tc>
+          <w:tcPr>
+            <w:tcW w:type="dxa" w:w="3971"/>
+            <w:tcBorders>
+              <w:top w:val="single" w:color="D1D5DB" w:sz="3"/>
+              <w:left w:val="single" w:color="D1D5DB" w:sz="3"/>
+              <w:bottom w:val="single" w:color="D1D5DB" w:sz="3"/>
+              <w:right w:val="single" w:color="D1D5DB" w:sz="3"/>
+            </w:tcBorders>
+            <w:shd w:fill="FFFFFF" w:val="clear"/>
+            <w:tcMar>
+              <w:top w:type="dxa" w:w="80"/>
+              <w:left w:type="dxa" w:w="140"/>
+              <w:bottom w:type="dxa" w:w="80"/>
+              <w:right w:type="dxa" w:w="140"/>
+            </w:tcMar>
+            <w:vAlign w:val="center"/>
+          </w:tcPr>
+          <w:p>
+            <w:pPr>
+              <w:jc w:val="left"/>
+            </w:pPr>
+            <w:r>
+              <w:rPr>
+                <w:rFonts w:ascii="Arial" w:cs="Arial" w:eastAsia="Arial" w:hAnsi="Arial"/>
+                <w:b w:val="false"/>
+                <w:bCs w:val="false"/>
+                <w:color w:val="0D1117"/>
+                <w:sz w:val="18"/>
+                <w:szCs w:val="18"/>
+              </w:rPr>
+              <w:t xml:space="preserve">Conta própria criada, chave configurada, APIs Airbnb assinadas</w:t>
+            </w:r>
+          </w:p>
+        </w:tc>
+        <w:tc>
+          <w:tcPr>
+            <w:tcW w:type="dxa" w:w="1444"/>
+            <w:tcBorders>
+              <w:top w:val="single" w:color="D1D5DB" w:sz="3"/>
+              <w:left w:val="single" w:color="D1D5DB" w:sz="3"/>
+              <w:bottom w:val="single" w:color="D1D5DB" w:sz="3"/>
+              <w:right w:val="single" w:color="D1D5DB" w:sz="3"/>
+            </w:tcBorders>
+            <w:shd w:fill="FFFFFF" w:val="clear"/>
+            <w:tcMar>
+              <w:top w:type="dxa" w:w="80"/>
+              <w:left w:type="dxa" w:w="140"/>
+              <w:bottom w:type="dxa" w:w="80"/>
+              <w:right w:type="dxa" w:w="140"/>
+            </w:tcMar>
+            <w:vAlign w:val="center"/>
+          </w:tcPr>
+          <w:p>
+            <w:pPr>
+              <w:jc w:val="left"/>
+            </w:pPr>
+            <w:r>
+              <w:rPr>
+                <w:rFonts w:ascii="Arial" w:cs="Arial" w:eastAsia="Arial" w:hAnsi="Arial"/>
+                <w:b w:val="false"/>
+                <w:bCs w:val="false"/>
+                <w:color w:val="0D1117"/>
+                <w:sz w:val="18"/>
+                <w:szCs w:val="18"/>
+              </w:rPr>
+              <w:t xml:space="preserve">D8</w:t>
+            </w:r>
+          </w:p>
+        </w:tc>
+      </w:tr>
+      <w:tr>
+        <w:tc>
+          <w:tcPr>
+            <w:tcW w:type="dxa" w:w="3610"/>
+            <w:tcBorders>
+              <w:top w:val="single" w:color="D1D5DB" w:sz="3"/>
+              <w:left w:val="single" w:color="D1D5DB" w:sz="3"/>
+              <w:bottom w:val="single" w:color="D1D5DB" w:sz="3"/>
+              <w:right w:val="single" w:color="D1D5DB" w:sz="3"/>
+            </w:tcBorders>
+            <w:shd w:fill="F5F4EF" w:val="clear"/>
+            <w:tcMar>
+              <w:top w:type="dxa" w:w="80"/>
+              <w:left w:type="dxa" w:w="140"/>
+              <w:bottom w:type="dxa" w:w="80"/>
+              <w:right w:type="dxa" w:w="140"/>
+            </w:tcMar>
+            <w:vAlign w:val="center"/>
+          </w:tcPr>
+          <w:p>
+            <w:pPr>
+              <w:jc w:val="left"/>
+            </w:pPr>
+            <w:r>
+              <w:rPr>
+                <w:rFonts w:ascii="Arial" w:cs="Arial" w:eastAsia="Arial" w:hAnsi="Arial"/>
+                <w:b w:val="false"/>
+                <w:bCs w:val="false"/>
+                <w:color w:val="0D1117"/>
+                <w:sz w:val="18"/>
+                <w:szCs w:val="18"/>
+              </w:rPr>
+              <w:t xml:space="preserve">Sentry — monitoramento de erros</w:t>
+            </w:r>
+          </w:p>
+        </w:tc>
+        <w:tc>
+          <w:tcPr>
+            <w:tcW w:type="dxa" w:w="3971"/>
+            <w:tcBorders>
+              <w:top w:val="single" w:color="D1D5DB" w:sz="3"/>
+              <w:left w:val="single" w:color="D1D5DB" w:sz="3"/>
+              <w:bottom w:val="single" w:color="D1D5DB" w:sz="3"/>
+              <w:right w:val="single" w:color="D1D5DB" w:sz="3"/>
+            </w:tcBorders>
+            <w:shd w:fill="F5F4EF" w:val="clear"/>
+            <w:tcMar>
+              <w:top w:type="dxa" w:w="80"/>
+              <w:left w:type="dxa" w:w="140"/>
+              <w:bottom w:type="dxa" w:w="80"/>
+              <w:right w:type="dxa" w:w="140"/>
+            </w:tcMar>
+            <w:vAlign w:val="center"/>
+          </w:tcPr>
+          <w:p>
+            <w:pPr>
+              <w:jc w:val="left"/>
+            </w:pPr>
+            <w:r>
+              <w:rPr>
+                <w:rFonts w:ascii="Arial" w:cs="Arial" w:eastAsia="Arial" w:hAnsi="Arial"/>
+                <w:b w:val="false"/>
+                <w:bCs w:val="false"/>
+                <w:color w:val="0D1117"/>
+                <w:sz w:val="18"/>
+                <w:szCs w:val="18"/>
+              </w:rPr>
+              <w:t xml:space="preserve">Backend NestJS + Frontend Next.js monitorados em produção</w:t>
+            </w:r>
+          </w:p>
+        </w:tc>
+        <w:tc>
+          <w:tcPr>
+            <w:tcW w:type="dxa" w:w="1444"/>
+            <w:tcBorders>
+              <w:top w:val="single" w:color="D1D5DB" w:sz="3"/>
+              <w:left w:val="single" w:color="D1D5DB" w:sz="3"/>
+              <w:bottom w:val="single" w:color="D1D5DB" w:sz="3"/>
+              <w:right w:val="single" w:color="D1D5DB" w:sz="3"/>
+            </w:tcBorders>
+            <w:shd w:fill="F5F4EF" w:val="clear"/>
+            <w:tcMar>
+              <w:top w:type="dxa" w:w="80"/>
+              <w:left w:type="dxa" w:w="140"/>
+              <w:bottom w:type="dxa" w:w="80"/>
+              <w:right w:type="dxa" w:w="140"/>
+            </w:tcMar>
+            <w:vAlign w:val="center"/>
+          </w:tcPr>
+          <w:p>
+            <w:pPr>
+              <w:jc w:val="left"/>
+            </w:pPr>
+            <w:r>
+              <w:rPr>
+                <w:rFonts w:ascii="Arial" w:cs="Arial" w:eastAsia="Arial" w:hAnsi="Arial"/>
+                <w:b w:val="false"/>
+                <w:bCs w:val="false"/>
+                <w:color w:val="0D1117"/>
+                <w:sz w:val="18"/>
+                <w:szCs w:val="18"/>
+              </w:rPr>
+              <w:t xml:space="preserve">D8</w:t>
+            </w:r>
+          </w:p>
+        </w:tc>
+      </w:tr>
+      <w:tr>
+        <w:tc>
+          <w:tcPr>
+            <w:tcW w:type="dxa" w:w="3610"/>
+            <w:tcBorders>
+              <w:top w:val="single" w:color="D1D5DB" w:sz="3"/>
+              <w:left w:val="single" w:color="D1D5DB" w:sz="3"/>
+              <w:bottom w:val="single" w:color="D1D5DB" w:sz="3"/>
+              <w:right w:val="single" w:color="D1D5DB" w:sz="3"/>
+            </w:tcBorders>
+            <w:shd w:fill="FFFFFF" w:val="clear"/>
+            <w:tcMar>
+              <w:top w:type="dxa" w:w="80"/>
+              <w:left w:type="dxa" w:w="140"/>
+              <w:bottom w:type="dxa" w:w="80"/>
+              <w:right w:type="dxa" w:w="140"/>
+            </w:tcMar>
+            <w:vAlign w:val="center"/>
+          </w:tcPr>
+          <w:p>
+            <w:pPr>
+              <w:jc w:val="left"/>
+            </w:pPr>
+            <w:r>
+              <w:rPr>
+                <w:rFonts w:ascii="Arial" w:cs="Arial" w:eastAsia="Arial" w:hAnsi="Arial"/>
+                <w:b w:val="false"/>
+                <w:bCs w:val="false"/>
+                <w:color w:val="0D1117"/>
+                <w:sz w:val="18"/>
+                <w:szCs w:val="18"/>
+              </w:rPr>
+              <w:t xml:space="preserve">DNS myurbanai.com (Hostinger)</w:t>
+            </w:r>
+          </w:p>
+        </w:tc>
+        <w:tc>
+          <w:tcPr>
+            <w:tcW w:type="dxa" w:w="3971"/>
+            <w:tcBorders>
+              <w:top w:val="single" w:color="D1D5DB" w:sz="3"/>
+              <w:left w:val="single" w:color="D1D5DB" w:sz="3"/>
+              <w:bottom w:val="single" w:color="D1D5DB" w:sz="3"/>
+              <w:right w:val="single" w:color="D1D5DB" w:sz="3"/>
+            </w:tcBorders>
+            <w:shd w:fill="FFFFFF" w:val="clear"/>
+            <w:tcMar>
+              <w:top w:type="dxa" w:w="80"/>
+              <w:left w:type="dxa" w:w="140"/>
+              <w:bottom w:type="dxa" w:w="80"/>
+              <w:right w:type="dxa" w:w="140"/>
+            </w:tcMar>
+            <w:vAlign w:val="center"/>
+          </w:tcPr>
+          <w:p>
+            <w:pPr>
+              <w:jc w:val="left"/>
+            </w:pPr>
+            <w:r>
+              <w:rPr>
+                <w:rFonts w:ascii="Arial" w:cs="Arial" w:eastAsia="Arial" w:hAnsi="Arial"/>
+                <w:b w:val="false"/>
+                <w:bCs w:val="false"/>
+                <w:color w:val="0D1117"/>
+                <w:sz w:val="18"/>
+                <w:szCs w:val="18"/>
+              </w:rPr>
+              <w:t xml:space="preserve">app.myurbanai.com apontando para Railway via CNAME</w:t>
             </w:r>
           </w:p>
         </w:tc>
@@ -3706,7 +4134,7 @@
               <w:bottom w:val="none" w:color="FFFFFF" w:sz="0"/>
               <w:right w:val="none" w:color="FFFFFF" w:sz="0"/>
             </w:tcBorders>
-            <w:shd w:fill="EF4444" w:val="clear"/>
+            <w:shd w:fill="E8500A" w:val="clear"/>
             <w:tcMar>
               <w:top w:type="dxa" w:w="90"/>
               <w:left w:type="dxa" w:w="180"/>
@@ -3724,7 +4152,7 @@
                 <w:sz w:val="22"/>
                 <w:szCs w:val="22"/>
               </w:rPr>
-              <w:t xml:space="preserve">  ITENS ATRASADOS — PENDENTES (dependem de terceiros)</w:t>
+              <w:t xml:space="preserve">  STATUS DOS ITENS CRÍTICOS — D11 (17/03/2026)</w:t>
             </w:r>
           </w:p>
         </w:tc>
@@ -3750,11 +4178,11 @@
           <w:bCs/>
           <w:i w:val="false"/>
           <w:iCs w:val="false"/>
-          <w:color w:val="0D9488"/>
+          <w:color w:val="E8500A"/>
           <w:sz w:val="18"/>
           <w:szCs w:val="18"/>
         </w:rPr>
-        <w:t xml:space="preserve">Os 4 Quick Wins foram concluídos em D8. </w:t>
+        <w:t xml:space="preserve">Atualização completa em D11. </w:t>
       </w:r>
       <w:r>
         <w:rPr>
@@ -3763,11 +4191,11 @@
           <w:bCs w:val="false"/>
           <w:i w:val="false"/>
           <w:iCs w:val="false"/>
-          <w:color w:val="EF4444"/>
+          <w:color w:val="0D1117"/>
           <w:sz w:val="18"/>
           <w:szCs w:val="18"/>
         </w:rPr>
-        <w:t xml:space="preserve">Itens abaixo dependem de resposta de terceiros (Lumina Lab / Fabrício).</w:t>
+        <w:t xml:space="preserve">SSH, dump e apontamento DNS resolvidos. Importação do banco e testes em andamento hoje.</w:t>
       </w:r>
     </w:p>
     <w:tbl>
@@ -3794,12 +4222,12 @@
           <w:tcPr>
             <w:tcW w:type="dxa" w:w="2979"/>
             <w:tcBorders>
-              <w:top w:val="single" w:color="EF4444" w:sz="1"/>
-              <w:left w:val="single" w:color="EF4444" w:sz="1"/>
-              <w:bottom w:val="single" w:color="EF4444" w:sz="1"/>
-              <w:right w:val="single" w:color="EF4444" w:sz="1"/>
-            </w:tcBorders>
-            <w:shd w:fill="EF4444" w:val="clear"/>
+              <w:top w:val="single" w:color="0D1117" w:sz="1"/>
+              <w:left w:val="single" w:color="0D1117" w:sz="1"/>
+              <w:bottom w:val="single" w:color="0D1117" w:sz="1"/>
+              <w:right w:val="single" w:color="0D1117" w:sz="1"/>
+            </w:tcBorders>
+            <w:shd w:fill="0D1117" w:val="clear"/>
             <w:tcMar>
               <w:top w:type="dxa" w:w="100"/>
               <w:left w:type="dxa" w:w="140"/>
@@ -3829,12 +4257,12 @@
           <w:tcPr>
             <w:tcW w:type="dxa" w:w="812"/>
             <w:tcBorders>
-              <w:top w:val="single" w:color="EF4444" w:sz="1"/>
-              <w:left w:val="single" w:color="EF4444" w:sz="1"/>
-              <w:bottom w:val="single" w:color="EF4444" w:sz="1"/>
-              <w:right w:val="single" w:color="EF4444" w:sz="1"/>
-            </w:tcBorders>
-            <w:shd w:fill="EF4444" w:val="clear"/>
+              <w:top w:val="single" w:color="0D1117" w:sz="1"/>
+              <w:left w:val="single" w:color="0D1117" w:sz="1"/>
+              <w:bottom w:val="single" w:color="0D1117" w:sz="1"/>
+              <w:right w:val="single" w:color="0D1117" w:sz="1"/>
+            </w:tcBorders>
+            <w:shd w:fill="0D1117" w:val="clear"/>
             <w:tcMar>
               <w:top w:type="dxa" w:w="100"/>
               <w:left w:type="dxa" w:w="140"/>
@@ -3864,12 +4292,12 @@
           <w:tcPr>
             <w:tcW w:type="dxa" w:w="812"/>
             <w:tcBorders>
-              <w:top w:val="single" w:color="EF4444" w:sz="1"/>
-              <w:left w:val="single" w:color="EF4444" w:sz="1"/>
-              <w:bottom w:val="single" w:color="EF4444" w:sz="1"/>
-              <w:right w:val="single" w:color="EF4444" w:sz="1"/>
-            </w:tcBorders>
-            <w:shd w:fill="EF4444" w:val="clear"/>
+              <w:top w:val="single" w:color="0D1117" w:sz="1"/>
+              <w:left w:val="single" w:color="0D1117" w:sz="1"/>
+              <w:bottom w:val="single" w:color="0D1117" w:sz="1"/>
+              <w:right w:val="single" w:color="0D1117" w:sz="1"/>
+            </w:tcBorders>
+            <w:shd w:fill="0D1117" w:val="clear"/>
             <w:tcMar>
               <w:top w:type="dxa" w:w="100"/>
               <w:left w:type="dxa" w:w="140"/>
@@ -3891,7 +4319,7 @@
                 <w:sz w:val="18"/>
                 <w:szCs w:val="18"/>
               </w:rPr>
-              <w:t xml:space="preserve">Nova Data</w:t>
+              <w:t xml:space="preserve">Realizado</w:t>
             </w:r>
           </w:p>
         </w:tc>
@@ -3899,12 +4327,12 @@
           <w:tcPr>
             <w:tcW w:type="dxa" w:w="1173"/>
             <w:tcBorders>
-              <w:top w:val="single" w:color="EF4444" w:sz="1"/>
-              <w:left w:val="single" w:color="EF4444" w:sz="1"/>
-              <w:bottom w:val="single" w:color="EF4444" w:sz="1"/>
-              <w:right w:val="single" w:color="EF4444" w:sz="1"/>
-            </w:tcBorders>
-            <w:shd w:fill="EF4444" w:val="clear"/>
+              <w:top w:val="single" w:color="0D1117" w:sz="1"/>
+              <w:left w:val="single" w:color="0D1117" w:sz="1"/>
+              <w:bottom w:val="single" w:color="0D1117" w:sz="1"/>
+              <w:right w:val="single" w:color="0D1117" w:sz="1"/>
+            </w:tcBorders>
+            <w:shd w:fill="0D1117" w:val="clear"/>
             <w:tcMar>
               <w:top w:type="dxa" w:w="100"/>
               <w:left w:type="dxa" w:w="140"/>
@@ -3926,7 +4354,7 @@
                 <w:sz w:val="18"/>
                 <w:szCs w:val="18"/>
               </w:rPr>
-              <w:t xml:space="preserve">Atraso</w:t>
+              <w:t xml:space="preserve">Status</w:t>
             </w:r>
           </w:p>
         </w:tc>
@@ -3934,12 +4362,12 @@
           <w:tcPr>
             <w:tcW w:type="dxa" w:w="3249"/>
             <w:tcBorders>
-              <w:top w:val="single" w:color="EF4444" w:sz="1"/>
-              <w:left w:val="single" w:color="EF4444" w:sz="1"/>
-              <w:bottom w:val="single" w:color="EF4444" w:sz="1"/>
-              <w:right w:val="single" w:color="EF4444" w:sz="1"/>
-            </w:tcBorders>
-            <w:shd w:fill="EF4444" w:val="clear"/>
+              <w:top w:val="single" w:color="0D1117" w:sz="1"/>
+              <w:left w:val="single" w:color="0D1117" w:sz="1"/>
+              <w:bottom w:val="single" w:color="0D1117" w:sz="1"/>
+              <w:right w:val="single" w:color="0D1117" w:sz="1"/>
+            </w:tcBorders>
+            <w:shd w:fill="0D1117" w:val="clear"/>
             <w:tcMar>
               <w:top w:type="dxa" w:w="100"/>
               <w:left w:type="dxa" w:w="140"/>
@@ -3961,7 +4389,7 @@
                 <w:sz w:val="18"/>
                 <w:szCs w:val="18"/>
               </w:rPr>
-              <w:t xml:space="preserve">Ação Necessária</w:t>
+              <w:t xml:space="preserve">Observação</w:t>
             </w:r>
           </w:p>
         </w:tc>
@@ -4066,7 +4494,7 @@
                 <w:sz w:val="18"/>
                 <w:szCs w:val="18"/>
               </w:rPr>
-              <w:t xml:space="preserve">D8-9</w:t>
+              <w:t xml:space="preserve">D11</w:t>
             </w:r>
           </w:p>
         </w:tc>
@@ -4101,7 +4529,7 @@
                 <w:sz w:val="17"/>
                 <w:szCs w:val="17"/>
               </w:rPr>
-              <w:t xml:space="preserve">+7 dias</w:t>
+              <w:t xml:space="preserve">✓ Feito</w:t>
             </w:r>
           </w:p>
         </w:tc>
@@ -4136,7 +4564,7 @@
                 <w:sz w:val="18"/>
                 <w:szCs w:val="18"/>
               </w:rPr>
-              <w:t xml:space="preserve">Solicitar credenciais ao time Lumina Lab</w:t>
+              <w:t xml:space="preserve">Acesso obtido — dump extraído com sucesso</w:t>
             </w:r>
           </w:p>
         </w:tc>
@@ -4173,7 +4601,7 @@
                 <w:sz w:val="18"/>
                 <w:szCs w:val="18"/>
               </w:rPr>
-              <w:t xml:space="preserve">Solicitar dump do banco on-premise</w:t>
+              <w:t xml:space="preserve">Dump do banco on-premise</w:t>
             </w:r>
           </w:p>
         </w:tc>
@@ -4241,7 +4669,7 @@
                 <w:sz w:val="18"/>
                 <w:szCs w:val="18"/>
               </w:rPr>
-              <w:t xml:space="preserve">D8-9</w:t>
+              <w:t xml:space="preserve">D11</w:t>
             </w:r>
           </w:p>
         </w:tc>
@@ -4276,7 +4704,7 @@
                 <w:sz w:val="17"/>
                 <w:szCs w:val="17"/>
               </w:rPr>
-              <w:t xml:space="preserve">+6 dias</w:t>
+              <w:t xml:space="preserve">✓ Feito</w:t>
             </w:r>
           </w:p>
         </w:tc>
@@ -4311,7 +4739,7 @@
                 <w:sz w:val="18"/>
                 <w:szCs w:val="18"/>
               </w:rPr>
-              <w:t xml:space="preserve">Depende do SSH — iniciar contato D8</w:t>
+              <w:t xml:space="preserve">Arquivo recebido da Lumina Lab — pronto para import</w:t>
             </w:r>
           </w:p>
         </w:tc>
@@ -4416,7 +4844,7 @@
                 <w:sz w:val="18"/>
                 <w:szCs w:val="18"/>
               </w:rPr>
-              <w:t xml:space="preserve">D9-10</w:t>
+              <w:t xml:space="preserve">D11</w:t>
             </w:r>
           </w:p>
         </w:tc>
@@ -4451,7 +4879,7 @@
                 <w:sz w:val="17"/>
                 <w:szCs w:val="17"/>
               </w:rPr>
-              <w:t xml:space="preserve">+5 dias</w:t>
+              <w:t xml:space="preserve">🔄 Agora</w:t>
             </w:r>
           </w:p>
         </w:tc>
@@ -4486,7 +4914,7 @@
                 <w:sz w:val="18"/>
                 <w:szCs w:val="18"/>
               </w:rPr>
-              <w:t xml:space="preserve">Bloqueado pelo dump — executar logo após receber</w:t>
+              <w:t xml:space="preserve">Executando hoje — dados reais no Railway</w:t>
             </w:r>
           </w:p>
         </w:tc>
@@ -4523,7 +4951,7 @@
                 <w:sz w:val="18"/>
                 <w:szCs w:val="18"/>
               </w:rPr>
-              <w:t xml:space="preserve">Transferência domínio urbanai.com.br</w:t>
+              <w:t xml:space="preserve">Apontamento temporário urbanai.com.br</w:t>
             </w:r>
           </w:p>
         </w:tc>
@@ -4591,7 +5019,7 @@
                 <w:sz w:val="18"/>
                 <w:szCs w:val="18"/>
               </w:rPr>
-              <w:t xml:space="preserve">D9-10</w:t>
+              <w:t xml:space="preserve">D11</w:t>
             </w:r>
           </w:p>
         </w:tc>
@@ -4626,7 +5054,7 @@
                 <w:sz w:val="17"/>
                 <w:szCs w:val="17"/>
               </w:rPr>
-              <w:t xml:space="preserve">+6 dias</w:t>
+              <w:t xml:space="preserve">✓ Feito</w:t>
             </w:r>
           </w:p>
         </w:tc>
@@ -4661,7 +5089,7 @@
                 <w:sz w:val="18"/>
                 <w:szCs w:val="18"/>
               </w:rPr>
-              <w:t xml:space="preserve">Contato formal com Lumina Lab + Hostinger</w:t>
+              <w:t xml:space="preserve">Lumina fez apontamento DNS temporário para nova infra</w:t>
             </w:r>
           </w:p>
         </w:tc>
@@ -4698,7 +5126,7 @@
                 <w:sz w:val="18"/>
                 <w:szCs w:val="18"/>
               </w:rPr>
-              <w:t xml:space="preserve">Migração RapidAPI (conta Fabrício)</w:t>
+              <w:t xml:space="preserve">Transferência domínio urbanai.com.br</w:t>
             </w:r>
           </w:p>
         </w:tc>
@@ -4731,7 +5159,7 @@
                 <w:sz w:val="17"/>
                 <w:szCs w:val="17"/>
               </w:rPr>
-              <w:t xml:space="preserve">D3-5</w:t>
+              <w:t xml:space="preserve">D2-3</w:t>
             </w:r>
           </w:p>
         </w:tc>
@@ -4766,7 +5194,7 @@
                 <w:sz w:val="18"/>
                 <w:szCs w:val="18"/>
               </w:rPr>
-              <w:t xml:space="preserve">D10-11</w:t>
+              <w:t xml:space="preserve">D12+</w:t>
             </w:r>
           </w:p>
         </w:tc>
@@ -4801,7 +5229,7 @@
                 <w:sz w:val="17"/>
                 <w:szCs w:val="17"/>
               </w:rPr>
-              <w:t xml:space="preserve">+6 dias</w:t>
+              <w:t xml:space="preserve">🔄 Solicitado</w:t>
             </w:r>
           </w:p>
         </w:tc>
@@ -4836,7 +5264,7 @@
                 <w:sz w:val="18"/>
                 <w:szCs w:val="18"/>
               </w:rPr>
-              <w:t xml:space="preserve">Agendar reunião com Fabrício — urgente</w:t>
+              <w:t xml:space="preserve">Transferência formal solicitada — pode levar 2-5 dias úteis</w:t>
             </w:r>
           </w:p>
         </w:tc>
@@ -4873,7 +5301,7 @@
                 <w:sz w:val="18"/>
                 <w:szCs w:val="18"/>
               </w:rPr>
-              <w:t xml:space="preserve">Teste completo do sistema</w:t>
+              <w:t xml:space="preserve">Migração RapidAPI (conta Fabrício)</w:t>
             </w:r>
           </w:p>
         </w:tc>
@@ -4906,7 +5334,7 @@
                 <w:sz w:val="17"/>
                 <w:szCs w:val="17"/>
               </w:rPr>
-              <w:t xml:space="preserve">D6-7</w:t>
+              <w:t xml:space="preserve">D3-5</w:t>
             </w:r>
           </w:p>
         </w:tc>
@@ -4941,7 +5369,7 @@
                 <w:sz w:val="18"/>
                 <w:szCs w:val="18"/>
               </w:rPr>
-              <w:t xml:space="preserve">D9-10</w:t>
+              <w:t xml:space="preserve">D12-13</w:t>
             </w:r>
           </w:p>
         </w:tc>
@@ -4976,7 +5404,7 @@
                 <w:sz w:val="17"/>
                 <w:szCs w:val="17"/>
               </w:rPr>
-              <w:t xml:space="preserve">+3 dias</w:t>
+              <w:t xml:space="preserve">⏳ Aguardando</w:t>
             </w:r>
           </w:p>
         </w:tc>
@@ -5011,7 +5439,182 @@
                 <w:sz w:val="18"/>
                 <w:szCs w:val="18"/>
               </w:rPr>
-              <w:t xml:space="preserve">Depende do banco importado para ser definitivo</w:t>
+              <w:t xml:space="preserve">Nova conta Urban AI criada — aguardando migração das assinaturas</w:t>
+            </w:r>
+          </w:p>
+        </w:tc>
+      </w:tr>
+      <w:tr>
+        <w:tc>
+          <w:tcPr>
+            <w:tcW w:type="dxa" w:w="2979"/>
+            <w:tcBorders>
+              <w:top w:val="single" w:color="D1D5DB" w:sz="3"/>
+              <w:left w:val="single" w:color="D1D5DB" w:sz="3"/>
+              <w:bottom w:val="single" w:color="D1D5DB" w:sz="3"/>
+              <w:right w:val="single" w:color="D1D5DB" w:sz="3"/>
+            </w:tcBorders>
+            <w:shd w:fill="FFFFFF" w:val="clear"/>
+            <w:tcMar>
+              <w:top w:type="dxa" w:w="80"/>
+              <w:left w:type="dxa" w:w="140"/>
+              <w:bottom w:type="dxa" w:w="80"/>
+              <w:right w:type="dxa" w:w="140"/>
+            </w:tcMar>
+            <w:vAlign w:val="center"/>
+          </w:tcPr>
+          <w:p>
+            <w:pPr>
+              <w:jc w:val="left"/>
+            </w:pPr>
+            <w:r>
+              <w:rPr>
+                <w:rFonts w:ascii="Arial" w:cs="Arial" w:eastAsia="Arial" w:hAnsi="Arial"/>
+                <w:b w:val="false"/>
+                <w:bCs w:val="false"/>
+                <w:color w:val="0D1117"/>
+                <w:sz w:val="18"/>
+                <w:szCs w:val="18"/>
+              </w:rPr>
+              <w:t xml:space="preserve">Teste completo do sistema</w:t>
+            </w:r>
+          </w:p>
+        </w:tc>
+        <w:tc>
+          <w:tcPr>
+            <w:tcW w:type="dxa" w:w="812"/>
+            <w:tcBorders>
+              <w:top w:val="single" w:color="D1D5DB" w:sz="3"/>
+              <w:left w:val="single" w:color="D1D5DB" w:sz="3"/>
+              <w:bottom w:val="single" w:color="D1D5DB" w:sz="3"/>
+              <w:right w:val="single" w:color="D1D5DB" w:sz="3"/>
+            </w:tcBorders>
+            <w:shd w:fill="F3F4F6" w:val="clear"/>
+            <w:tcMar>
+              <w:top w:type="dxa" w:w="80"/>
+              <w:left w:type="dxa" w:w="140"/>
+              <w:bottom w:type="dxa" w:w="80"/>
+              <w:right w:type="dxa" w:w="140"/>
+            </w:tcMar>
+            <w:vAlign w:val="center"/>
+          </w:tcPr>
+          <w:p>
+            <w:pPr>
+              <w:jc w:val="center"/>
+            </w:pPr>
+            <w:r>
+              <w:rPr>
+                <w:rFonts w:ascii="Arial" w:cs="Arial" w:eastAsia="Arial" w:hAnsi="Arial"/>
+                <w:color w:val="6B7280"/>
+                <w:sz w:val="17"/>
+                <w:szCs w:val="17"/>
+              </w:rPr>
+              <w:t xml:space="preserve">D6-7</w:t>
+            </w:r>
+          </w:p>
+        </w:tc>
+        <w:tc>
+          <w:tcPr>
+            <w:tcW w:type="dxa" w:w="812"/>
+            <w:tcBorders>
+              <w:top w:val="single" w:color="E8500A" w:sz="6"/>
+              <w:left w:val="single" w:color="E8500A" w:sz="6"/>
+              <w:bottom w:val="single" w:color="E8500A" w:sz="6"/>
+              <w:right w:val="single" w:color="E8500A" w:sz="6"/>
+            </w:tcBorders>
+            <w:shd w:fill="FFF0E8" w:val="clear"/>
+            <w:tcMar>
+              <w:top w:type="dxa" w:w="80"/>
+              <w:left w:type="dxa" w:w="140"/>
+              <w:bottom w:type="dxa" w:w="80"/>
+              <w:right w:type="dxa" w:w="140"/>
+            </w:tcMar>
+            <w:vAlign w:val="center"/>
+          </w:tcPr>
+          <w:p>
+            <w:pPr>
+              <w:jc w:val="center"/>
+            </w:pPr>
+            <w:r>
+              <w:rPr>
+                <w:rFonts w:ascii="Arial" w:cs="Arial" w:eastAsia="Arial" w:hAnsi="Arial"/>
+                <w:b/>
+                <w:bCs/>
+                <w:color w:val="E8500A"/>
+                <w:sz w:val="18"/>
+                <w:szCs w:val="18"/>
+              </w:rPr>
+              <w:t xml:space="preserve">D11-12</w:t>
+            </w:r>
+          </w:p>
+        </w:tc>
+        <w:tc>
+          <w:tcPr>
+            <w:tcW w:type="dxa" w:w="1173"/>
+            <w:tcBorders>
+              <w:top w:val="single" w:color="D1D5DB" w:sz="3"/>
+              <w:left w:val="single" w:color="D1D5DB" w:sz="3"/>
+              <w:bottom w:val="single" w:color="D1D5DB" w:sz="3"/>
+              <w:right w:val="single" w:color="D1D5DB" w:sz="3"/>
+            </w:tcBorders>
+            <w:shd w:fill="FEE2E2" w:val="clear"/>
+            <w:tcMar>
+              <w:top w:type="dxa" w:w="80"/>
+              <w:left w:type="dxa" w:w="140"/>
+              <w:bottom w:type="dxa" w:w="80"/>
+              <w:right w:type="dxa" w:w="140"/>
+            </w:tcMar>
+            <w:vAlign w:val="center"/>
+          </w:tcPr>
+          <w:p>
+            <w:pPr>
+              <w:jc w:val="center"/>
+            </w:pPr>
+            <w:r>
+              <w:rPr>
+                <w:rFonts w:ascii="Arial" w:cs="Arial" w:eastAsia="Arial" w:hAnsi="Arial"/>
+                <w:b/>
+                <w:bCs/>
+                <w:color w:val="EF4444"/>
+                <w:sz w:val="17"/>
+                <w:szCs w:val="17"/>
+              </w:rPr>
+              <w:t xml:space="preserve">🔄 Agora</w:t>
+            </w:r>
+          </w:p>
+        </w:tc>
+        <w:tc>
+          <w:tcPr>
+            <w:tcW w:type="dxa" w:w="3249"/>
+            <w:tcBorders>
+              <w:top w:val="single" w:color="D1D5DB" w:sz="3"/>
+              <w:left w:val="single" w:color="D1D5DB" w:sz="3"/>
+              <w:bottom w:val="single" w:color="D1D5DB" w:sz="3"/>
+              <w:right w:val="single" w:color="D1D5DB" w:sz="3"/>
+            </w:tcBorders>
+            <w:shd w:fill="FFFFFF" w:val="clear"/>
+            <w:tcMar>
+              <w:top w:type="dxa" w:w="80"/>
+              <w:left w:type="dxa" w:w="140"/>
+              <w:bottom w:type="dxa" w:w="80"/>
+              <w:right w:type="dxa" w:w="140"/>
+            </w:tcMar>
+            <w:vAlign w:val="center"/>
+          </w:tcPr>
+          <w:p>
+            <w:pPr>
+              <w:jc w:val="left"/>
+            </w:pPr>
+            <w:r>
+              <w:rPr>
+                <w:rFonts w:ascii="Arial" w:cs="Arial" w:eastAsia="Arial" w:hAnsi="Arial"/>
+                <w:b w:val="false"/>
+                <w:bCs w:val="false"/>
+                <w:color w:val="0D1117"/>
+                <w:sz w:val="18"/>
+                <w:szCs w:val="18"/>
+              </w:rPr>
+              <w:t xml:space="preserve">Inicia após import do banco concluído</w:t>
             </w:r>
           </w:p>
         </w:tc>
@@ -6158,7 +6761,7 @@
                 <w:sz w:val="18"/>
                 <w:szCs w:val="18"/>
               </w:rPr>
-              <w:t xml:space="preserve">D8</w:t>
+              <w:t xml:space="preserve">D11</w:t>
             </w:r>
           </w:p>
         </w:tc>
@@ -6193,7 +6796,7 @@
                 <w:sz w:val="17"/>
                 <w:szCs w:val="17"/>
               </w:rPr>
-              <w:t xml:space="preserve">12/03</w:t>
+              <w:t xml:space="preserve">17/03</w:t>
             </w:r>
           </w:p>
         </w:tc>
@@ -6226,7 +6829,7 @@
                 <w:sz w:val="17"/>
                 <w:szCs w:val="17"/>
               </w:rPr>
-              <w:t xml:space="preserve">• ✓ Quick win: billing alerts Railway (concluído)</w:t>
+              <w:t xml:space="preserve">• ✓ SSH ao servidor on-premise (concluído)</w:t>
             </w:r>
           </w:p>
           <w:p>
@@ -6240,7 +6843,7 @@
                 <w:sz w:val="17"/>
                 <w:szCs w:val="17"/>
               </w:rPr>
-              <w:t xml:space="preserve">• ✓ Quick win: backup automático MySQL — Pro Plan ativo (concluído)</w:t>
+              <w:t xml:space="preserve">• ✓ Dump do banco recebido (concluído)</w:t>
             </w:r>
           </w:p>
           <w:p>
@@ -6254,7 +6857,7 @@
                 <w:sz w:val="17"/>
                 <w:szCs w:val="17"/>
               </w:rPr>
-              <w:t xml:space="preserve">• ✓ Quick win: UptimeRobot monitoramento (concluído)</w:t>
+              <w:t xml:space="preserve">• ✓ Apontamento temporário urbanai.com.br (concluído)</w:t>
             </w:r>
           </w:p>
           <w:p>
@@ -6268,7 +6871,7 @@
                 <w:sz w:val="17"/>
                 <w:szCs w:val="17"/>
               </w:rPr>
-              <w:t xml:space="preserve">• ✓ Quick win: firewall Railway — portas internas fechadas (concluído)</w:t>
+              <w:t xml:space="preserve">• Importar banco no Railway MySQL (hoje)</w:t>
             </w:r>
           </w:p>
           <w:p>
@@ -6282,7 +6885,7 @@
                 <w:sz w:val="17"/>
                 <w:szCs w:val="17"/>
               </w:rPr>
-              <w:t xml:space="preserve">• ✓ Google Cloud: Maps API + OAuth 2.0 configurados — R$ 1.759 crédito aprovado (concluído)</w:t>
+              <w:t xml:space="preserve">• Revisar permissões do banco (mínimo privilégio)</w:t>
             </w:r>
           </w:p>
           <w:p>
@@ -6296,7 +6899,7 @@
                 <w:sz w:val="17"/>
                 <w:szCs w:val="17"/>
               </w:rPr>
-              <w:t xml:space="preserve">• Configurar env vars Google no Railway + testar fluxo de login</w:t>
+              <w:t xml:space="preserve">• Testar fluxo completo: cadastro → login → KNN</w:t>
             </w:r>
           </w:p>
         </w:tc>
@@ -6329,7 +6932,7 @@
                 <w:sz w:val="17"/>
                 <w:szCs w:val="17"/>
               </w:rPr>
-              <w:t xml:space="preserve">• Solicitar SSH ao servidor Lumina Lab</w:t>
+              <w:t xml:space="preserve">• ✓ Transferência domínio urbanai.com.br solicitada formalmente</w:t>
             </w:r>
           </w:p>
           <w:p>
@@ -6343,7 +6946,7 @@
                 <w:sz w:val="17"/>
                 <w:szCs w:val="17"/>
               </w:rPr>
-              <w:t xml:space="preserve">• Solicitar dump do banco on-premise</w:t>
+              <w:t xml:space="preserve">• Aguardar processamento da transferência (2-5 dias)</w:t>
             </w:r>
           </w:p>
           <w:p>
@@ -6357,93 +6960,79 @@
                 <w:sz w:val="17"/>
                 <w:szCs w:val="17"/>
               </w:rPr>
-              <w:t xml:space="preserve">• Contato formal: transferência domínio urbanai.com.br</w:t>
-            </w:r>
-          </w:p>
-          <w:p>
-            <w:pPr>
-              <w:spacing w:after="20" w:before="20"/>
-            </w:pPr>
-            <w:r>
-              <w:rPr>
-                <w:rFonts w:ascii="Arial" w:cs="Arial" w:eastAsia="Arial" w:hAnsi="Arial"/>
+              <w:t xml:space="preserve">• Follow-up com Fabrício sobre migração RapidAPI</w:t>
+            </w:r>
+          </w:p>
+        </w:tc>
+      </w:tr>
+      <w:tr>
+        <w:tc>
+          <w:tcPr>
+            <w:tcW w:type="dxa" w:w="722"/>
+            <w:tcBorders>
+              <w:top w:val="single" w:color="D1D5DB" w:sz="3"/>
+              <w:left w:val="single" w:color="D1D5DB" w:sz="3"/>
+              <w:bottom w:val="single" w:color="D1D5DB" w:sz="3"/>
+              <w:right w:val="single" w:color="D1D5DB" w:sz="3"/>
+            </w:tcBorders>
+            <w:shd w:fill="F5F4EF" w:val="clear"/>
+            <w:tcMar>
+              <w:top w:type="dxa" w:w="80"/>
+              <w:left w:type="dxa" w:w="140"/>
+              <w:bottom w:type="dxa" w:w="80"/>
+              <w:right w:type="dxa" w:w="140"/>
+            </w:tcMar>
+            <w:vAlign w:val="center"/>
+          </w:tcPr>
+          <w:p>
+            <w:pPr>
+              <w:jc w:val="left"/>
+            </w:pPr>
+            <w:r>
+              <w:rPr>
+                <w:rFonts w:ascii="Arial" w:cs="Arial" w:eastAsia="Arial" w:hAnsi="Arial"/>
+                <w:b/>
+                <w:bCs/>
+                <w:color w:val="0D1117"/>
+                <w:sz w:val="18"/>
+                <w:szCs w:val="18"/>
+              </w:rPr>
+              <w:t xml:space="preserve">D12</w:t>
+            </w:r>
+          </w:p>
+        </w:tc>
+        <w:tc>
+          <w:tcPr>
+            <w:tcW w:type="dxa" w:w="903"/>
+            <w:tcBorders>
+              <w:top w:val="single" w:color="D1D5DB" w:sz="3"/>
+              <w:left w:val="single" w:color="D1D5DB" w:sz="3"/>
+              <w:bottom w:val="single" w:color="D1D5DB" w:sz="3"/>
+              <w:right w:val="single" w:color="D1D5DB" w:sz="3"/>
+            </w:tcBorders>
+            <w:shd w:fill="F5F4EF" w:val="clear"/>
+            <w:tcMar>
+              <w:top w:type="dxa" w:w="80"/>
+              <w:left w:type="dxa" w:w="140"/>
+              <w:bottom w:type="dxa" w:w="80"/>
+              <w:right w:type="dxa" w:w="140"/>
+            </w:tcMar>
+            <w:vAlign w:val="center"/>
+          </w:tcPr>
+          <w:p>
+            <w:pPr>
+              <w:jc w:val="left"/>
+            </w:pPr>
+            <w:r>
+              <w:rPr>
+                <w:rFonts w:ascii="Arial" w:cs="Arial" w:eastAsia="Arial" w:hAnsi="Arial"/>
+                <w:b w:val="false"/>
+                <w:bCs w:val="false"/>
                 <w:color w:val="0D1117"/>
                 <w:sz w:val="17"/>
                 <w:szCs w:val="17"/>
               </w:rPr>
-              <w:t xml:space="preserve">• Agendar reunião com Fabrício (RapidAPI)</w:t>
-            </w:r>
-          </w:p>
-        </w:tc>
-      </w:tr>
-      <w:tr>
-        <w:tc>
-          <w:tcPr>
-            <w:tcW w:type="dxa" w:w="722"/>
-            <w:tcBorders>
-              <w:top w:val="single" w:color="D1D5DB" w:sz="3"/>
-              <w:left w:val="single" w:color="D1D5DB" w:sz="3"/>
-              <w:bottom w:val="single" w:color="D1D5DB" w:sz="3"/>
-              <w:right w:val="single" w:color="D1D5DB" w:sz="3"/>
-            </w:tcBorders>
-            <w:shd w:fill="F5F4EF" w:val="clear"/>
-            <w:tcMar>
-              <w:top w:type="dxa" w:w="80"/>
-              <w:left w:type="dxa" w:w="140"/>
-              <w:bottom w:type="dxa" w:w="80"/>
-              <w:right w:type="dxa" w:w="140"/>
-            </w:tcMar>
-            <w:vAlign w:val="center"/>
-          </w:tcPr>
-          <w:p>
-            <w:pPr>
-              <w:jc w:val="left"/>
-            </w:pPr>
-            <w:r>
-              <w:rPr>
-                <w:rFonts w:ascii="Arial" w:cs="Arial" w:eastAsia="Arial" w:hAnsi="Arial"/>
-                <w:b/>
-                <w:bCs/>
-                <w:color w:val="0D1117"/>
-                <w:sz w:val="18"/>
-                <w:szCs w:val="18"/>
-              </w:rPr>
-              <w:t xml:space="preserve">D9</w:t>
-            </w:r>
-          </w:p>
-        </w:tc>
-        <w:tc>
-          <w:tcPr>
-            <w:tcW w:type="dxa" w:w="903"/>
-            <w:tcBorders>
-              <w:top w:val="single" w:color="D1D5DB" w:sz="3"/>
-              <w:left w:val="single" w:color="D1D5DB" w:sz="3"/>
-              <w:bottom w:val="single" w:color="D1D5DB" w:sz="3"/>
-              <w:right w:val="single" w:color="D1D5DB" w:sz="3"/>
-            </w:tcBorders>
-            <w:shd w:fill="F5F4EF" w:val="clear"/>
-            <w:tcMar>
-              <w:top w:type="dxa" w:w="80"/>
-              <w:left w:type="dxa" w:w="140"/>
-              <w:bottom w:type="dxa" w:w="80"/>
-              <w:right w:type="dxa" w:w="140"/>
-            </w:tcMar>
-            <w:vAlign w:val="center"/>
-          </w:tcPr>
-          <w:p>
-            <w:pPr>
-              <w:jc w:val="left"/>
-            </w:pPr>
-            <w:r>
-              <w:rPr>
-                <w:rFonts w:ascii="Arial" w:cs="Arial" w:eastAsia="Arial" w:hAnsi="Arial"/>
-                <w:b w:val="false"/>
-                <w:bCs w:val="false"/>
-                <w:color w:val="0D1117"/>
-                <w:sz w:val="17"/>
-                <w:szCs w:val="17"/>
-              </w:rPr>
-              <w:t xml:space="preserve">13/03</w:t>
+              <w:t xml:space="preserve">18/03</w:t>
             </w:r>
           </w:p>
         </w:tc>
@@ -6476,7 +7065,7 @@
                 <w:sz w:val="17"/>
                 <w:szCs w:val="17"/>
               </w:rPr>
-              <w:t xml:space="preserve">• Importar banco MySQL (se dump chegar)</w:t>
+              <w:t xml:space="preserve">• Testar Stripe webhook (assinatura + cancelamento)</w:t>
             </w:r>
           </w:p>
           <w:p>
@@ -6490,7 +7079,7 @@
                 <w:sz w:val="17"/>
                 <w:szCs w:val="17"/>
               </w:rPr>
-              <w:t xml:space="preserve">• Teste ponta a ponta do sistema com dados reais</w:t>
+              <w:t xml:space="preserve">• Rodar 7 spiders manualmente e verificar dados no S3</w:t>
             </w:r>
           </w:p>
           <w:p>
@@ -6504,7 +7093,21 @@
                 <w:sz w:val="17"/>
                 <w:szCs w:val="17"/>
               </w:rPr>
-              <w:t xml:space="preserve">• Testar cadastro → assinatura → dashboard → KNN</w:t>
+              <w:t xml:space="preserve">• Documentar bugs encontrados e priorizar por gravidade</w:t>
+            </w:r>
+          </w:p>
+          <w:p>
+            <w:pPr>
+              <w:spacing w:after="20" w:before="20"/>
+            </w:pPr>
+            <w:r>
+              <w:rPr>
+                <w:rFonts w:ascii="Arial" w:cs="Arial" w:eastAsia="Arial" w:hAnsi="Arial"/>
+                <w:color w:val="0D1117"/>
+                <w:sz w:val="17"/>
+                <w:szCs w:val="17"/>
+              </w:rPr>
+              <w:t xml:space="preserve">• Corrigir bugs de alta prioridade (bloqueiam usuário)</w:t>
             </w:r>
           </w:p>
         </w:tc>
@@ -6537,7 +7140,7 @@
                 <w:sz w:val="17"/>
                 <w:szCs w:val="17"/>
               </w:rPr>
-              <w:t xml:space="preserve">• Acompanhar status da transferência de domínio</w:t>
+              <w:t xml:space="preserve">• Acompanhar status transferência domínio</w:t>
             </w:r>
           </w:p>
           <w:p>
@@ -6551,7 +7154,7 @@
                 <w:sz w:val="17"/>
                 <w:szCs w:val="17"/>
               </w:rPr>
-              <w:t xml:space="preserve">• Follow-up com Fabrício sobre RapidAPI</w:t>
+              <w:t xml:space="preserve">• Follow-up Fabrício — migração RapidAPI</w:t>
             </w:r>
           </w:p>
           <w:p>
@@ -6565,7 +7168,7 @@
                 <w:sz w:val="17"/>
                 <w:szCs w:val="17"/>
               </w:rPr>
-              <w:t xml:space="preserve">• Follow-up com Lumina Lab sobre SSH/dump</w:t>
+              <w:t xml:space="preserve">• Verificar SSL após apontamento DNS urbanai.com.br</w:t>
             </w:r>
           </w:p>
         </w:tc>
@@ -6602,7 +7205,7 @@
                 <w:sz w:val="18"/>
                 <w:szCs w:val="18"/>
               </w:rPr>
-              <w:t xml:space="preserve">D10</w:t>
+              <w:t xml:space="preserve">D13</w:t>
             </w:r>
           </w:p>
         </w:tc>
@@ -6637,7 +7240,7 @@
                 <w:sz w:val="17"/>
                 <w:szCs w:val="17"/>
               </w:rPr>
-              <w:t xml:space="preserve">14/03</w:t>
+              <w:t xml:space="preserve">19/03</w:t>
             </w:r>
           </w:p>
         </w:tc>
@@ -6670,7 +7273,7 @@
                 <w:sz w:val="17"/>
                 <w:szCs w:val="17"/>
               </w:rPr>
-              <w:t xml:space="preserve">• Atualizar todas as env vars com chaves Google Cloud</w:t>
+              <w:t xml:space="preserve">• Revogar acessos Lumina Lab + rotacionar credenciais</w:t>
             </w:r>
           </w:p>
           <w:p>
@@ -6684,7 +7287,7 @@
                 <w:sz w:val="17"/>
                 <w:szCs w:val="17"/>
               </w:rPr>
-              <w:t xml:space="preserve">• Testar Stripe webhook (cancelamento)</w:t>
+              <w:t xml:space="preserve">• Verificar certificado SSL em todos os domínios</w:t>
             </w:r>
           </w:p>
           <w:p>
@@ -6698,7 +7301,7 @@
                 <w:sz w:val="17"/>
                 <w:szCs w:val="17"/>
               </w:rPr>
-              <w:t xml:space="preserve">• Rodar 7 spiders manualmente e verificar dados</w:t>
+              <w:t xml:space="preserve">• Testar fluxo de notificações e mensageria</w:t>
             </w:r>
           </w:p>
           <w:p>
@@ -6712,7 +7315,7 @@
                 <w:sz w:val="17"/>
                 <w:szCs w:val="17"/>
               </w:rPr>
-              <w:t xml:space="preserve">• Documentar bugs encontrados (priorizar por gravidade)</w:t>
+              <w:t xml:space="preserve">• Teste ponta a ponta final com dados reais</w:t>
             </w:r>
           </w:p>
         </w:tc>
@@ -6745,7 +7348,7 @@
                 <w:sz w:val="17"/>
                 <w:szCs w:val="17"/>
               </w:rPr>
-              <w:t xml:space="preserve">• Confirmar chegada do dump do banco (se pendente)</w:t>
+              <w:t xml:space="preserve">• Confirmar revogação de acessos com Lumina Lab</w:t>
             </w:r>
           </w:p>
           <w:p>
@@ -6759,7 +7362,21 @@
                 <w:sz w:val="17"/>
                 <w:szCs w:val="17"/>
               </w:rPr>
-              <w:t xml:space="preserve">• Confirmar reunião com Fabrício</w:t>
+              <w:t xml:space="preserve">• Validar e-mails saindo pelo Mailersend Urban AI</w:t>
+            </w:r>
+          </w:p>
+          <w:p>
+            <w:pPr>
+              <w:spacing w:after="20" w:before="20"/>
+            </w:pPr>
+            <w:r>
+              <w:rPr>
+                <w:rFonts w:ascii="Arial" w:cs="Arial" w:eastAsia="Arial" w:hAnsi="Arial"/>
+                <w:color w:val="0D1117"/>
+                <w:sz w:val="17"/>
+                <w:szCs w:val="17"/>
+              </w:rPr>
+              <w:t xml:space="preserve">• Confirmar migração RapidAPI se Fabrício responder</w:t>
             </w:r>
           </w:p>
         </w:tc>
@@ -6796,7 +7413,7 @@
                 <w:sz w:val="18"/>
                 <w:szCs w:val="18"/>
               </w:rPr>
-              <w:t xml:space="preserve">D11</w:t>
+              <w:t xml:space="preserve">D14</w:t>
             </w:r>
           </w:p>
         </w:tc>
@@ -6831,7 +7448,7 @@
                 <w:sz w:val="17"/>
                 <w:szCs w:val="17"/>
               </w:rPr>
-              <w:t xml:space="preserve">17/03</w:t>
+              <w:t xml:space="preserve">20/03</w:t>
             </w:r>
           </w:p>
         </w:tc>
@@ -6864,7 +7481,7 @@
                 <w:sz w:val="17"/>
                 <w:szCs w:val="17"/>
               </w:rPr>
-              <w:t xml:space="preserve">• Redirecionar DNS para nova infra (após testes OK)</w:t>
+              <w:t xml:space="preserve">• Checklist final de segurança e acessos</w:t>
             </w:r>
           </w:p>
           <w:p>
@@ -6878,7 +7495,7 @@
                 <w:sz w:val="17"/>
                 <w:szCs w:val="17"/>
               </w:rPr>
-              <w:t xml:space="preserve">• Verificar certificado SSL após mudança de DNS</w:t>
+              <w:t xml:space="preserve">• Validar sistema 100% operacional em myurbanai.com</w:t>
             </w:r>
           </w:p>
           <w:p>
@@ -6892,7 +7509,7 @@
                 <w:sz w:val="17"/>
                 <w:szCs w:val="17"/>
               </w:rPr>
-              <w:t xml:space="preserve">• Configurar Sentry (captura de erros em prod)</w:t>
+              <w:t xml:space="preserve">• Documentar status final do sprint para o cliente</w:t>
             </w:r>
           </w:p>
         </w:tc>
@@ -6925,7 +7542,7 @@
                 <w:sz w:val="17"/>
                 <w:szCs w:val="17"/>
               </w:rPr>
-              <w:t xml:space="preserve">• Acesso RapidAPI (se Fabrício confirmar)</w:t>
+              <w:t xml:space="preserve">• Confirmar transferência domínio concluída ou status</w:t>
             </w:r>
           </w:p>
           <w:p>
@@ -6939,187 +7556,7 @@
                 <w:sz w:val="17"/>
                 <w:szCs w:val="17"/>
               </w:rPr>
-              <w:t xml:space="preserve">• Confirmar status transferência domínio</w:t>
-            </w:r>
-          </w:p>
-        </w:tc>
-      </w:tr>
-      <w:tr>
-        <w:tc>
-          <w:tcPr>
-            <w:tcW w:type="dxa" w:w="722"/>
-            <w:tcBorders>
-              <w:top w:val="single" w:color="D1D5DB" w:sz="3"/>
-              <w:left w:val="single" w:color="D1D5DB" w:sz="3"/>
-              <w:bottom w:val="single" w:color="D1D5DB" w:sz="3"/>
-              <w:right w:val="single" w:color="D1D5DB" w:sz="3"/>
-            </w:tcBorders>
-            <w:shd w:fill="FFFFFF" w:val="clear"/>
-            <w:tcMar>
-              <w:top w:type="dxa" w:w="80"/>
-              <w:left w:type="dxa" w:w="140"/>
-              <w:bottom w:type="dxa" w:w="80"/>
-              <w:right w:type="dxa" w:w="140"/>
-            </w:tcMar>
-            <w:vAlign w:val="center"/>
-          </w:tcPr>
-          <w:p>
-            <w:pPr>
-              <w:jc w:val="left"/>
-            </w:pPr>
-            <w:r>
-              <w:rPr>
-                <w:rFonts w:ascii="Arial" w:cs="Arial" w:eastAsia="Arial" w:hAnsi="Arial"/>
-                <w:b/>
-                <w:bCs/>
-                <w:color w:val="0D1117"/>
-                <w:sz w:val="18"/>
-                <w:szCs w:val="18"/>
-              </w:rPr>
-              <w:t xml:space="preserve">D12</w:t>
-            </w:r>
-          </w:p>
-        </w:tc>
-        <w:tc>
-          <w:tcPr>
-            <w:tcW w:type="dxa" w:w="903"/>
-            <w:tcBorders>
-              <w:top w:val="single" w:color="D1D5DB" w:sz="3"/>
-              <w:left w:val="single" w:color="D1D5DB" w:sz="3"/>
-              <w:bottom w:val="single" w:color="D1D5DB" w:sz="3"/>
-              <w:right w:val="single" w:color="D1D5DB" w:sz="3"/>
-            </w:tcBorders>
-            <w:shd w:fill="FFFFFF" w:val="clear"/>
-            <w:tcMar>
-              <w:top w:type="dxa" w:w="80"/>
-              <w:left w:type="dxa" w:w="140"/>
-              <w:bottom w:type="dxa" w:w="80"/>
-              <w:right w:type="dxa" w:w="140"/>
-            </w:tcMar>
-            <w:vAlign w:val="center"/>
-          </w:tcPr>
-          <w:p>
-            <w:pPr>
-              <w:jc w:val="left"/>
-            </w:pPr>
-            <w:r>
-              <w:rPr>
-                <w:rFonts w:ascii="Arial" w:cs="Arial" w:eastAsia="Arial" w:hAnsi="Arial"/>
-                <w:b w:val="false"/>
-                <w:bCs w:val="false"/>
-                <w:color w:val="0D1117"/>
-                <w:sz w:val="17"/>
-                <w:szCs w:val="17"/>
-              </w:rPr>
-              <w:t xml:space="preserve">18/03</w:t>
-            </w:r>
-          </w:p>
-        </w:tc>
-        <w:tc>
-          <w:tcPr>
-            <w:tcW w:type="dxa" w:w="3701"/>
-            <w:tcBorders>
-              <w:top w:val="single" w:color="3B82F6" w:sz="4"/>
-              <w:left w:val="single" w:color="3B82F6" w:sz="4"/>
-              <w:bottom w:val="single" w:color="3B82F6" w:sz="4"/>
-              <w:right w:val="single" w:color="3B82F6" w:sz="4"/>
-            </w:tcBorders>
-            <w:shd w:fill="DBEAFE" w:val="clear"/>
-            <w:tcMar>
-              <w:top w:type="dxa" w:w="80"/>
-              <w:left w:type="dxa" w:w="140"/>
-              <w:bottom w:type="dxa" w:w="80"/>
-              <w:right w:type="dxa" w:w="140"/>
-            </w:tcMar>
-            <w:vAlign w:val="top"/>
-          </w:tcPr>
-          <w:p>
-            <w:pPr>
-              <w:spacing w:after="20" w:before="20"/>
-            </w:pPr>
-            <w:r>
-              <w:rPr>
-                <w:rFonts w:ascii="Arial" w:cs="Arial" w:eastAsia="Arial" w:hAnsi="Arial"/>
-                <w:color w:val="0D1117"/>
-                <w:sz w:val="17"/>
-                <w:szCs w:val="17"/>
-              </w:rPr>
-              <w:t xml:space="preserve">• Revogar acessos Lumina Lab + rotacionar credenciais</w:t>
-            </w:r>
-          </w:p>
-          <w:p>
-            <w:pPr>
-              <w:spacing w:after="20" w:before="20"/>
-            </w:pPr>
-            <w:r>
-              <w:rPr>
-                <w:rFonts w:ascii="Arial" w:cs="Arial" w:eastAsia="Arial" w:hAnsi="Arial"/>
-                <w:color w:val="0D1117"/>
-                <w:sz w:val="17"/>
-                <w:szCs w:val="17"/>
-              </w:rPr>
-              <w:t xml:space="preserve">• Revisar permissões banco (mínimo privilégio)</w:t>
-            </w:r>
-          </w:p>
-          <w:p>
-            <w:pPr>
-              <w:spacing w:after="20" w:before="20"/>
-            </w:pPr>
-            <w:r>
-              <w:rPr>
-                <w:rFonts w:ascii="Arial" w:cs="Arial" w:eastAsia="Arial" w:hAnsi="Arial"/>
-                <w:color w:val="0D1117"/>
-                <w:sz w:val="17"/>
-                <w:szCs w:val="17"/>
-              </w:rPr>
-              <w:t xml:space="preserve">• Corrigir bugs de alta prioridade levantados em D10</w:t>
-            </w:r>
-          </w:p>
-        </w:tc>
-        <w:tc>
-          <w:tcPr>
-            <w:tcW w:type="dxa" w:w="3701"/>
-            <w:tcBorders>
-              <w:top w:val="single" w:color="E8500A" w:sz="4"/>
-              <w:left w:val="single" w:color="E8500A" w:sz="4"/>
-              <w:bottom w:val="single" w:color="E8500A" w:sz="4"/>
-              <w:right w:val="single" w:color="E8500A" w:sz="4"/>
-            </w:tcBorders>
-            <w:shd w:fill="FFF0E8" w:val="clear"/>
-            <w:tcMar>
-              <w:top w:type="dxa" w:w="80"/>
-              <w:left w:type="dxa" w:w="140"/>
-              <w:bottom w:type="dxa" w:w="80"/>
-              <w:right w:type="dxa" w:w="140"/>
-            </w:tcMar>
-            <w:vAlign w:val="top"/>
-          </w:tcPr>
-          <w:p>
-            <w:pPr>
-              <w:spacing w:after="20" w:before="20"/>
-            </w:pPr>
-            <w:r>
-              <w:rPr>
-                <w:rFonts w:ascii="Arial" w:cs="Arial" w:eastAsia="Arial" w:hAnsi="Arial"/>
-                <w:color w:val="0D1117"/>
-                <w:sz w:val="17"/>
-                <w:szCs w:val="17"/>
-              </w:rPr>
-              <w:t xml:space="preserve">• Confirmar revogação de acessos com Lumina Lab</w:t>
-            </w:r>
-          </w:p>
-          <w:p>
-            <w:pPr>
-              <w:spacing w:after="20" w:before="20"/>
-            </w:pPr>
-            <w:r>
-              <w:rPr>
-                <w:rFonts w:ascii="Arial" w:cs="Arial" w:eastAsia="Arial" w:hAnsi="Arial"/>
-                <w:color w:val="0D1117"/>
-                <w:sz w:val="17"/>
-                <w:szCs w:val="17"/>
-              </w:rPr>
-              <w:t xml:space="preserve">• Validar domínio ativo e e-mails funcionando</w:t>
+              <w:t xml:space="preserve">• Confirmar todos os acessos Lumina revogados</w:t>
             </w:r>
           </w:p>
         </w:tc>
@@ -7670,7 +8107,7 @@
                 <w:sz w:val="18"/>
                 <w:szCs w:val="18"/>
               </w:rPr>
-              <w:t xml:space="preserve">D1-7</w:t>
+              <w:t xml:space="preserve">D1-11</w:t>
             </w:r>
           </w:p>
         </w:tc>
@@ -7740,7 +8177,7 @@
                 <w:sz w:val="18"/>
                 <w:szCs w:val="18"/>
               </w:rPr>
-              <w:t xml:space="preserve">*Dump/import do banco pendente</w:t>
+              <w:t xml:space="preserve">*Import do banco em execução D11 — 95% concluído</w:t>
             </w:r>
           </w:p>
         </w:tc>
@@ -7847,7 +8284,7 @@
                 <w:sz w:val="18"/>
                 <w:szCs w:val="18"/>
               </w:rPr>
-              <w:t xml:space="preserve">D1-10</w:t>
+              <w:t xml:space="preserve">D1-13</w:t>
             </w:r>
           </w:p>
         </w:tc>
@@ -7917,7 +8354,7 @@
                 <w:sz w:val="18"/>
                 <w:szCs w:val="18"/>
               </w:rPr>
-              <w:t xml:space="preserve">DNS e domínio pendentes — nova meta D8-11</w:t>
+              <w:t xml:space="preserve">Apontamento temporário ativo — transferência formal em andamento</w:t>
             </w:r>
           </w:p>
         </w:tc>
@@ -8094,7 +8531,7 @@
                 <w:sz w:val="18"/>
                 <w:szCs w:val="18"/>
               </w:rPr>
-              <w:t xml:space="preserve">7 itens antecipados — testes iniciam D8</w:t>
+              <w:t xml:space="preserve">Testes iniciando D11 — permissões banco e spiders pendentes</w:t>
             </w:r>
           </w:p>
         </w:tc>
@@ -8712,7 +9149,7 @@
           <w:sz w:val="19"/>
           <w:szCs w:val="19"/>
         </w:rPr>
-        <w:t xml:space="preserve">Adiantamento técnico: </w:t>
+        <w:t xml:space="preserve">Posição em D11: </w:t>
       </w:r>
       <w:r>
         <w:rPr>
@@ -8725,7 +9162,7 @@
           <w:sz w:val="19"/>
           <w:szCs w:val="19"/>
         </w:rPr>
-        <w:t xml:space="preserve">Infraestrutura completa no ar, 7 bugs críticos corrigidos, 4 quick wins concluídas e Google Cloud configurado em D8. Railway Pro Plan ativo com backups diários e monitoramento 24/7.</w:t>
+        <w:t xml:space="preserve">34 entregas concluídas. SSH obtido, dump recebido, importação do banco em execução hoje. Sistema tecnicamente completo — faltam apenas testes finais e revogação de acessos.</w:t>
       </w:r>
     </w:p>
     <w:p>
@@ -8744,7 +9181,7 @@
           <w:sz w:val="19"/>
           <w:szCs w:val="19"/>
         </w:rPr>
-        <w:t xml:space="preserve">Ganho financeiro — Google: </w:t>
+        <w:t xml:space="preserve">Ganhos financeiros — Cloud: </w:t>
       </w:r>
       <w:r>
         <w:rPr>
@@ -8757,7 +9194,7 @@
           <w:sz w:val="19"/>
           <w:szCs w:val="19"/>
         </w:rPr>
-        <w:t xml:space="preserve">Aprovação de R$ 1.759 em créditos gratuitos Google Cloud (válidos até 15/06/2026). Toda a infraestrutura de Maps, OAuth e GCP operará sem custo adicional por 90 dias.</w:t>
+        <w:t xml:space="preserve">R$ 1.759 em créditos Google Cloud (válidos até 15/06/2026) + USD 200 em créditos AWS. Infraestrutura de Maps, OAuth, S3 e data lake sem custo adicional por meses.</w:t>
       </w:r>
     </w:p>
     <w:p>
@@ -8776,7 +9213,7 @@
           <w:sz w:val="19"/>
           <w:szCs w:val="19"/>
         </w:rPr>
-        <w:t xml:space="preserve">Domínio de produção: </w:t>
+        <w:t xml:space="preserve">Domínios: </w:t>
       </w:r>
       <w:r>
         <w:rPr>
@@ -8789,7 +9226,7 @@
           <w:sz w:val="19"/>
           <w:szCs w:val="19"/>
         </w:rPr>
-        <w:t xml:space="preserve">Domínio app.myurbanai.com já registrado e configurado como URI de callback OAuth — pronto para apontar para a nova infraestrutura após transferência DNS.</w:t>
+        <w:t xml:space="preserve">app.myurbanai.com ativo via CNAME (Railway). urbanai.com.br com apontamento temporário ativo pela Lumina Lab — transferência formal em processamento (2-5 dias úteis).</w:t>
       </w:r>
     </w:p>
     <w:p>
@@ -8808,7 +9245,7 @@
           <w:sz w:val="19"/>
           <w:szCs w:val="19"/>
         </w:rPr>
-        <w:t xml:space="preserve">Ponto crítico — dados: </w:t>
+        <w:t xml:space="preserve">Único pendente de terceiros: </w:t>
       </w:r>
       <w:r>
         <w:rPr>
@@ -8821,7 +9258,7 @@
           <w:sz w:val="19"/>
           <w:szCs w:val="19"/>
         </w:rPr>
-        <w:t xml:space="preserve">O dump do banco on-premise é o próximo passo mais urgente. Sem ele o sistema funciona mas com dados zerados. Prioridade máxima: aguardar retorno Lumina Lab.</w:t>
+        <w:t xml:space="preserve">Migração das assinaturas RapidAPI da conta Fabrício para conta Urban AI. Nova chave própria já ativa — sistema funciona. Migração necessária para billing correto.</w:t>
       </w:r>
     </w:p>
     <w:p>
@@ -8840,7 +9277,7 @@
           <w:sz w:val="19"/>
           <w:szCs w:val="19"/>
         </w:rPr>
-        <w:t xml:space="preserve">Próximo marco — D11 (17/03):</w:t>
+        <w:t xml:space="preserve">Marco final — D14 (20/03): </w:t>
       </w:r>
       <w:r>
         <w:rPr>
@@ -8853,7 +9290,7 @@
           <w:sz w:val="19"/>
           <w:szCs w:val="19"/>
         </w:rPr>
-        <w:t xml:space="preserve">DNS novo ativo + SSL validado. Esse é o ponto de virada — o sistema estará 100% sob controle Urban AI.</w:t>
+        <w:t xml:space="preserve">Sistema 100% sob controle Urban AI: banco importado, domínios ativos, acessos Lumina revogados, testes aprovados. Pronto para beta e go-live.</w:t>
       </w:r>
     </w:p>
     <w:p>
@@ -8891,7 +9328,7 @@
           <w:sz w:val="15"/>
           <w:szCs w:val="15"/>
         </w:rPr>
-        <w:t xml:space="preserve">Urban AI © 2026 — Documento de uso interno. Sprint D1=03/03/2026 · D14=20/03/2026 (dias úteis). Gerado em 12/03/2026.</w:t>
+        <w:t xml:space="preserve">Urban AI © 2026 — Documento de uso interno. Sprint D1=03/03/2026 · D14=20/03/2026 (dias úteis). Gerado em 17/03/2026.</w:t>
       </w:r>
     </w:p>
     <w:sectPr>
@@ -8959,7 +9396,7 @@
         <w:sz w:val="16"/>
         <w:szCs w:val="16"/>
       </w:rPr>
-      <w:t xml:space="preserve">Urban AI  |  Relatório de Status D8/14  |  Página </w:t>
+      <w:t xml:space="preserve">Urban AI  |  Relatório de Status D11/14  |  Página </w:t>
     </w:r>
     <w:r>
       <w:rPr>

</xml_diff>